<commit_message>
feat: add simplified TFG project proposal in Quarto format with generated Word and PDF outputs
</commit_message>
<xml_diff>
--- a/Entregas/Actividad 3/TP3_Ayarachi_Fuentes_Simplificado.docx
+++ b/Entregas/Actividad 3/TP3_Ayarachi_Fuentes_Simplificado.docx
@@ -1099,33 +1099,35 @@
     <w:p>
       <w:pPr>
         <w:pStyle w:val="FirstParagraph"/>
-        <w:spacing w:before="0" w:after="40" w:line="276" w:lineRule="auto"/>
-        <w:jc w:val="center"/>
-      </w:pPr>
-      <w:r/>
-      <w:r>
-        <w:rPr>
-          <w:rFonts w:ascii="Arial" w:hAnsi="Arial"/>
+      </w:pPr>
+      <w:r>
+        <w:rPr>
           <w:b/>
-          <w:sz w:val="26"/>
-        </w:rPr>
-        <w:t>Evaluación del Desempeño Docente y Factibilidad de Implementación de un Modelo de Retroalimentación 360° en el Departamento de Administración Pública del CURZAS-UNCo (2025–2026)</w:t>
-      </w:r>
-    </w:p>
-    <w:p>
-      <w:pPr>
-        <w:spacing w:before="0" w:after="120" w:line="276" w:lineRule="auto"/>
-        <w:jc w:val="center"/>
-      </w:pPr>
-      <w:r>
-        <w:rPr>
-          <w:rFonts w:ascii="Arial" w:hAnsi="Arial"/>
-          <w:i/>
-          <w:sz w:val="22"/>
-        </w:rPr>
-        <w:t>(Trabajo Práctico N° 3: Estructura del Proyecto de Investigación de TFG — Versión Simplificada)</w:t>
-      </w:r>
-    </w:p>
+          <w:bCs/>
+        </w:rPr>
+        <w:t xml:space="preserve">Factibilidad de un Modelo de Retroalimentación 360° para la Evaluación Formativa del Desempeño Docente en el Departamento de Administración Pública del CURZAS-UNCo (2025–2026)</w:t>
+      </w:r>
+      <w:r>
+        <w:br/>
+      </w:r>
+      <w:r>
+        <w:rPr>
+          <w:i/>
+          <w:iCs/>
+        </w:rPr>
+        <w:t xml:space="preserve">(Trabajo Práctico N° 3: Estructura del Proyecto de Investigación de TFG — Versión Simplificada)</w:t>
+      </w:r>
+    </w:p>
+    <w:p>
+      <w:pPr>
+        <w:pStyle w:val="BodyText"/>
+      </w:pPr>
+      <w:r>
+        <w:br/>
+      </w:r>
+    </w:p>
+    <w:bookmarkEnd w:id="12"/>
+    <w:bookmarkStart w:id="30" w:name="X93daf59862c303dafb5cc95de0397a3e6de1ec0"/>
     <w:p>
       <w:pPr>
         <w:pStyle w:val="Heading1"/>
@@ -1807,7 +1809,7 @@
         <w:t xml:space="preserve"> </w:t>
       </w:r>
       <w:r>
-        <w:t xml:space="preserve">Clima de confianza institucional, disposición docente y estudiantil ante la coevaluación y superación de temores a controles punitivos.</w:t>
+        <w:t xml:space="preserve">Clima de confianza institucional, disposición docente y estudiantil ante la coevaluación y atenuación de eventuales temores a usos punitivos.</w:t>
       </w:r>
     </w:p>
     <w:p>
@@ -2215,7 +2217,7 @@
         <w:t xml:space="preserve"> </w:t>
       </w:r>
       <w:r>
-        <w:t xml:space="preserve">Presencia de obstáculos insalvables (colisión jurídica con el CCT, desconfianza generalizada o inviabilidad técnica del anonimato).</w:t>
+        <w:t xml:space="preserve">Presencia de obstáculos estructurales o incompatibilidades que impidan su adopción en las condiciones analizadas (colisión jurídica con el CCT Docente, desconfianza generalizada o inviabilidad técnica del anonimato).</w:t>
       </w:r>
     </w:p>
     <w:p>
@@ -2250,7 +2252,7 @@
         <w:pStyle w:val="BlockText"/>
       </w:pPr>
       <w:r>
-        <w:t xml:space="preserve">¿Cuáles son las condiciones de factibilidad organizacional, técnica, normativa y de gobernanza multinivel para la implementación de un modelo de retroalimentación multiactoral (360°) en la evaluación del desempeño docente en el Departamento de Administración Pública del CURZAS-UNCo durante el período 2025–2026?</w:t>
+        <w:t xml:space="preserve">¿Cuáles son las condiciones de factibilidad normativa, técnica, organizacional, cultural y de gobernanza para un modelo de retroalimentación multiactoral (360°) en la evaluación formativa del desempeño docente en el Departamento de Administración Pública del CURZAS-UNCo durante el período 2025–2026?</w:t>
       </w:r>
     </w:p>
     <w:bookmarkEnd w:id="23"/>
@@ -2392,7 +2394,7 @@
         </w:numPr>
       </w:pPr>
       <w:r>
-        <w:t xml:space="preserve">Determinar las condiciones de factibilidad organizacional, técnica, normativa y de gobernanza multinivel para la implementación de un modelo de retroalimentación multiactoral (360°) en la evaluación del desempeño docente en el Departamento de Administración Pública del CURZAS-UNCo (2025–2026).</w:t>
+        <w:t xml:space="preserve">Determinar las condiciones de factibilidad normativa, técnica, organizacional, cultural y de gobernanza para un modelo de retroalimentación multiactoral (360°) en la evaluación formativa del desempeño docente en el Departamento de Administración Pública del CURZAS-UNCo (2025–2026).</w:t>
       </w:r>
     </w:p>
     <w:bookmarkEnd w:id="26"/>
@@ -2446,7 +2448,7 @@
         </w:numPr>
       </w:pPr>
       <w:r>
-        <w:t xml:space="preserve">Identificar los condicionantes técnico-organizacionales, normativos y de gobernanza multinivel (acuerdos paritarios, confidencialidad y cogobierno) que inciden en la factibilidad del modelo.</w:t>
+        <w:t xml:space="preserve">Identificar los condicionantes normativos, técnico-organizacionales, culturales y de gobernanza multinivel (acuerdos paritarios, confidencialidad, confianza y cogobierno) que inciden en la factibilidad del modelo.</w:t>
       </w:r>
     </w:p>
     <w:p>
@@ -2826,13 +2828,13 @@
                 <w:b/>
                 <w:bCs/>
               </w:rPr>
-              <w:t xml:space="preserve">Dimensión de gobernanza:</w:t>
+              <w:t xml:space="preserve">Gobernanza y condiciones estructurales:</w:t>
             </w:r>
             <w:r>
               <w:t xml:space="preserve"> </w:t>
             </w:r>
             <w:r>
-              <w:t xml:space="preserve">Condicionantes paritarios, de cogobierno y plataformas técnicas</w:t>
+              <w:t xml:space="preserve">Condicionantes paritarios, normativos, técnicos y culturales</w:t>
             </w:r>
           </w:p>
         </w:tc>
@@ -3229,7 +3231,7 @@
         <w:t xml:space="preserve"> </w:t>
       </w:r>
       <w:r>
-        <w:t xml:space="preserve">Vincula la evaluación con las oportunidades de aprendizaje continuo y carrera docente (Art. 65 y 76 de la Ord. CS N° 0988/2025). Evaluar sin ofrecer instancias de capacitación reduce el proceso a una rutina burocrática sin impacto.</w:t>
+        <w:t xml:space="preserve">Vincula la evaluación con las oportunidades de aprendizaje continuo y carrera docente (Art. 65 y 76 de la Ord. CS N° 0988/2025). Evaluar sin ofrecer instancias de capacitación puede reducir el proceso a una rutina predominantemente burocrática, limitando su potencial formativo.</w:t>
       </w:r>
     </w:p>
     <w:p>
@@ -3425,7 +3427,7 @@
         <w:t xml:space="preserve"> </w:t>
       </w:r>
       <w:r>
-        <w:t xml:space="preserve">Apreciación de los estudiantes sobre la claridad expositiva, recursos didácticos y retroalimentación pedagógica, superando el rol de mero usuario administrativo.</w:t>
+        <w:t xml:space="preserve">Apreciación de los estudiantes sobre la claridad expositiva, recursos didácticos y retroalimentación pedagógica, incorporando la perspectiva estudiantil como fuente de información pedagógica.</w:t>
       </w:r>
     </w:p>
     <w:p>
@@ -3589,7 +3591,7 @@
         <w:t xml:space="preserve"> </w:t>
       </w:r>
       <w:r>
-        <w:t xml:space="preserve">mediante soluciones situadas. Trasladado al CURZAS, este enfoque fundamenta la necesidad de interconectar la sede central de Viedma con los Nodos de la Línea Sur y Costa Atlántica mediante redes tecnológicas de acompañamiento formativo, superando encuestas rígidas.</w:t>
+        <w:t xml:space="preserve">mediante soluciones situadas. Trasladado al CURZAS, este enfoque fundamenta la necesidad de interconectar la sede central de Viedma con los Nodos de la Línea Sur y Costa Atlántica mediante redes tecnológicas de acompañamiento formativo, ampliando la información disponible respecto de las encuestas estudiantiles aisladas.</w:t>
       </w:r>
     </w:p>
     <w:p>

</xml_diff>